<commit_message>
Update report template and Excel processing logic to use dynamic project ID labels
</commit_message>
<xml_diff>
--- a/report_template.docx
+++ b/report_template.docx
@@ -65,7 +65,7 @@
                 <w:rFonts w:ascii="標楷體" w:hAnsi="標楷體" w:eastAsia="標楷體"/>
                 <w:b/>
               </w:rPr>
-              <w:t>工程案號</w:t>
+              <w:t>{{ project_id_label }}</w:t>
             </w:r>
           </w:p>
         </w:tc>
@@ -515,7 +515,7 @@
                 <w:rFonts w:ascii="標楷體" w:hAnsi="標楷體" w:eastAsia="標楷體"/>
                 <w:b/>
               </w:rPr>
-              <w:t>工程案號</w:t>
+              <w:t>{{ project_id_label }}</w:t>
             </w:r>
           </w:p>
         </w:tc>

</xml_diff>